<commit_message>
Update service images and names for consistency
Replaced various service images in services.json and the upload directory with new PNG files for improved consistency and quality. Updated several service names and docx paths to match new naming conventions. Removed unused or duplicate image files and reorganized image assets for better structure.
</commit_message>
<xml_diff>
--- a/public/upload/service/chemical peel/Peel Image/Tài liệu không có tiêu đề.docx
+++ b/public/upload/service/chemical peel/Peel Image/Tài liệu không có tiêu đề.docx
@@ -12,6 +12,7 @@
         <w:jc w:val="center"/>
         <w:rPr>
           <w:b w:val="1"/>
+          <w:bCs w:val="1"/>
           <w:color w:val="343a40"/>
           <w:sz w:val="33"/>
           <w:szCs w:val="33"/>
@@ -22,6 +23,7 @@
       <w:r>
         <w:rPr>
           <w:b w:val="1"/>
+          <w:bCs w:val="1"/>
           <w:color w:val="343a40"/>
           <w:sz w:val="33"/>
           <w:szCs w:val="33"/>
@@ -79,6 +81,7 @@
         <w:spacing w:after="300" w:before="300" w:line="335.99999999999994" w:lineRule="auto"/>
         <w:rPr>
           <w:b w:val="1"/>
+          <w:bCs w:val="1"/>
           <w:color w:val="343a40"/>
           <w:sz w:val="27"/>
           <w:szCs w:val="27"/>
@@ -89,6 +92,7 @@
       <w:r>
         <w:rPr>
           <w:b w:val="1"/>
+          <w:bCs w:val="1"/>
           <w:color w:val="343a40"/>
           <w:sz w:val="27"/>
           <w:szCs w:val="27"/>
@@ -146,6 +150,7 @@
         <w:spacing w:after="300" w:before="220" w:line="335.99999999999994" w:lineRule="auto"/>
         <w:rPr>
           <w:b w:val="1"/>
+          <w:bCs w:val="1"/>
           <w:color w:val="343a40"/>
           <w:sz w:val="24"/>
           <w:szCs w:val="24"/>
@@ -156,6 +161,7 @@
       <w:r>
         <w:rPr>
           <w:b w:val="1"/>
+          <w:bCs w:val="1"/>
           <w:color w:val="343a40"/>
           <w:sz w:val="24"/>
           <w:szCs w:val="24"/>
@@ -163,6 +169,52 @@
         </w:rPr>
         <w:t xml:space="preserve">Giới thiệu công nghệ Peel Image (vi tảo canxi / enzyme sinh học)</w:t>
       </w:r>
+      <w:r>
+        <w:rPr>
+          <w:b w:val="1"/>
+          <w:bCs w:val="1"/>
+          <w:color w:val="343a40"/>
+          <w:sz w:val="24"/>
+          <w:szCs w:val="24"/>
+        </w:rPr>
+        <w:drawing>
+          <wp:inline distB="114300" distT="114300" distL="114300" distR="114300">
+            <wp:extent cx="5731200" cy="3822700"/>
+            <wp:effectExtent b="0" l="0" r="0" t="0"/>
+            <wp:docPr id="1" name="image1.jpg"/>
+            <a:graphic>
+              <a:graphicData uri="http://schemas.openxmlformats.org/drawingml/2006/picture">
+                <pic:pic>
+                  <pic:nvPicPr>
+                    <pic:cNvPr id="0" name="image1.jpg"/>
+                    <pic:cNvPicPr preferRelativeResize="0"/>
+                  </pic:nvPicPr>
+                  <pic:blipFill>
+                    <a:blip r:embed="rId6"/>
+                    <a:srcRect b="0" l="0" r="0" t="0"/>
+                    <a:stretch>
+                      <a:fillRect/>
+                    </a:stretch>
+                  </pic:blipFill>
+                  <pic:spPr>
+                    <a:xfrm>
+                      <a:off x="0" y="0"/>
+                      <a:ext cx="5731200" cy="3822700"/>
+                    </a:xfrm>
+                    <a:prstGeom prst="rect"/>
+                    <a:ln/>
+                  </pic:spPr>
+                </pic:pic>
+              </a:graphicData>
+            </a:graphic>
+          </wp:inline>
+        </w:drawing>
+      </w:r>
+      <w:r>
+        <w:rPr>
+          <w:rtl w:val="0"/>
+        </w:rPr>
+      </w:r>
     </w:p>
     <w:p>
       <w:pPr>
@@ -233,6 +285,7 @@
         <w:spacing w:after="300" w:before="220" w:line="335.99999999999994" w:lineRule="auto"/>
         <w:rPr>
           <w:b w:val="1"/>
+          <w:bCs w:val="1"/>
           <w:color w:val="343a40"/>
           <w:sz w:val="24"/>
           <w:szCs w:val="24"/>
@@ -243,6 +296,7 @@
       <w:r>
         <w:rPr>
           <w:b w:val="1"/>
+          <w:bCs w:val="1"/>
           <w:color w:val="343a40"/>
           <w:sz w:val="24"/>
           <w:szCs w:val="24"/>
@@ -320,6 +374,7 @@
         <w:spacing w:after="300" w:before="300" w:line="335.99999999999994" w:lineRule="auto"/>
         <w:rPr>
           <w:b w:val="1"/>
+          <w:bCs w:val="1"/>
           <w:color w:val="343a40"/>
           <w:sz w:val="27"/>
           <w:szCs w:val="27"/>
@@ -330,6 +385,7 @@
       <w:r>
         <w:rPr>
           <w:b w:val="1"/>
+          <w:bCs w:val="1"/>
           <w:color w:val="343a40"/>
           <w:sz w:val="27"/>
           <w:szCs w:val="27"/>
@@ -367,6 +423,7 @@
         <w:spacing w:after="300" w:before="220" w:line="335.99999999999994" w:lineRule="auto"/>
         <w:rPr>
           <w:b w:val="1"/>
+          <w:bCs w:val="1"/>
           <w:color w:val="343a40"/>
           <w:sz w:val="24"/>
           <w:szCs w:val="24"/>
@@ -377,6 +434,7 @@
       <w:r>
         <w:rPr>
           <w:b w:val="1"/>
+          <w:bCs w:val="1"/>
           <w:color w:val="343a40"/>
           <w:sz w:val="24"/>
           <w:szCs w:val="24"/>
@@ -454,6 +512,7 @@
         <w:spacing w:after="300" w:before="220" w:line="335.99999999999994" w:lineRule="auto"/>
         <w:rPr>
           <w:b w:val="1"/>
+          <w:bCs w:val="1"/>
           <w:color w:val="343a40"/>
           <w:sz w:val="24"/>
           <w:szCs w:val="24"/>
@@ -464,6 +523,7 @@
       <w:r>
         <w:rPr>
           <w:b w:val="1"/>
+          <w:bCs w:val="1"/>
           <w:color w:val="343a40"/>
           <w:sz w:val="24"/>
           <w:szCs w:val="24"/>
@@ -541,6 +601,7 @@
         <w:spacing w:after="300" w:before="220" w:line="335.99999999999994" w:lineRule="auto"/>
         <w:rPr>
           <w:b w:val="1"/>
+          <w:bCs w:val="1"/>
           <w:color w:val="343a40"/>
           <w:sz w:val="24"/>
           <w:szCs w:val="24"/>
@@ -551,6 +612,7 @@
       <w:r>
         <w:rPr>
           <w:b w:val="1"/>
+          <w:bCs w:val="1"/>
           <w:color w:val="343a40"/>
           <w:sz w:val="24"/>
           <w:szCs w:val="24"/>
@@ -628,6 +690,7 @@
         <w:spacing w:after="300" w:before="220" w:line="335.99999999999994" w:lineRule="auto"/>
         <w:rPr>
           <w:b w:val="1"/>
+          <w:bCs w:val="1"/>
           <w:color w:val="343a40"/>
           <w:sz w:val="24"/>
           <w:szCs w:val="24"/>
@@ -638,6 +701,7 @@
       <w:r>
         <w:rPr>
           <w:b w:val="1"/>
+          <w:bCs w:val="1"/>
           <w:color w:val="343a40"/>
           <w:sz w:val="24"/>
           <w:szCs w:val="24"/>
@@ -715,6 +779,7 @@
         <w:spacing w:after="300" w:before="300" w:line="335.99999999999994" w:lineRule="auto"/>
         <w:rPr>
           <w:b w:val="1"/>
+          <w:bCs w:val="1"/>
           <w:color w:val="343a40"/>
           <w:sz w:val="27"/>
           <w:szCs w:val="27"/>
@@ -725,9 +790,51 @@
       <w:r>
         <w:rPr>
           <w:b w:val="1"/>
+          <w:bCs w:val="1"/>
           <w:color w:val="343a40"/>
           <w:sz w:val="27"/>
           <w:szCs w:val="27"/>
+        </w:rPr>
+        <w:drawing>
+          <wp:inline distB="114300" distT="114300" distL="114300" distR="114300">
+            <wp:extent cx="5731200" cy="8597900"/>
+            <wp:effectExtent b="0" l="0" r="0" t="0"/>
+            <wp:docPr id="3" name="image2.jpg"/>
+            <a:graphic>
+              <a:graphicData uri="http://schemas.openxmlformats.org/drawingml/2006/picture">
+                <pic:pic>
+                  <pic:nvPicPr>
+                    <pic:cNvPr id="0" name="image2.jpg"/>
+                    <pic:cNvPicPr preferRelativeResize="0"/>
+                  </pic:nvPicPr>
+                  <pic:blipFill>
+                    <a:blip r:embed="rId7"/>
+                    <a:srcRect b="0" l="0" r="0" t="0"/>
+                    <a:stretch>
+                      <a:fillRect/>
+                    </a:stretch>
+                  </pic:blipFill>
+                  <pic:spPr>
+                    <a:xfrm>
+                      <a:off x="0" y="0"/>
+                      <a:ext cx="5731200" cy="8597900"/>
+                    </a:xfrm>
+                    <a:prstGeom prst="rect"/>
+                    <a:ln/>
+                  </pic:spPr>
+                </pic:pic>
+              </a:graphicData>
+            </a:graphic>
+          </wp:inline>
+        </w:drawing>
+      </w:r>
+      <w:r>
+        <w:rPr>
+          <w:b w:val="1"/>
+          <w:bCs w:val="1"/>
+          <w:color w:val="343a40"/>
+          <w:sz w:val="27"/>
+          <w:szCs w:val="27"/>
           <w:rtl w:val="0"/>
         </w:rPr>
         <w:t xml:space="preserve">Quy trình Peel Image tại Lahi Beauty Center</w:t>
@@ -782,6 +889,7 @@
         <w:spacing w:after="300" w:before="220" w:line="335.99999999999994" w:lineRule="auto"/>
         <w:rPr>
           <w:b w:val="1"/>
+          <w:bCs w:val="1"/>
           <w:color w:val="343a40"/>
           <w:sz w:val="24"/>
           <w:szCs w:val="24"/>
@@ -792,6 +900,7 @@
       <w:r>
         <w:rPr>
           <w:b w:val="1"/>
+          <w:bCs w:val="1"/>
           <w:color w:val="343a40"/>
           <w:sz w:val="24"/>
           <w:szCs w:val="24"/>
@@ -849,6 +958,7 @@
         <w:spacing w:after="300" w:before="220" w:line="335.99999999999994" w:lineRule="auto"/>
         <w:rPr>
           <w:b w:val="1"/>
+          <w:bCs w:val="1"/>
           <w:color w:val="343a40"/>
           <w:sz w:val="24"/>
           <w:szCs w:val="24"/>
@@ -859,6 +969,7 @@
       <w:r>
         <w:rPr>
           <w:b w:val="1"/>
+          <w:bCs w:val="1"/>
           <w:color w:val="343a40"/>
           <w:sz w:val="24"/>
           <w:szCs w:val="24"/>
@@ -916,6 +1027,7 @@
         <w:spacing w:after="300" w:before="220" w:line="335.99999999999994" w:lineRule="auto"/>
         <w:rPr>
           <w:b w:val="1"/>
+          <w:bCs w:val="1"/>
           <w:color w:val="343a40"/>
           <w:sz w:val="24"/>
           <w:szCs w:val="24"/>
@@ -926,6 +1038,7 @@
       <w:r>
         <w:rPr>
           <w:b w:val="1"/>
+          <w:bCs w:val="1"/>
           <w:color w:val="343a40"/>
           <w:sz w:val="24"/>
           <w:szCs w:val="24"/>
@@ -983,6 +1096,7 @@
         <w:spacing w:after="300" w:before="220" w:line="335.99999999999994" w:lineRule="auto"/>
         <w:rPr>
           <w:b w:val="1"/>
+          <w:bCs w:val="1"/>
           <w:color w:val="343a40"/>
           <w:sz w:val="24"/>
           <w:szCs w:val="24"/>
@@ -993,6 +1107,7 @@
       <w:r>
         <w:rPr>
           <w:b w:val="1"/>
+          <w:bCs w:val="1"/>
           <w:color w:val="343a40"/>
           <w:sz w:val="24"/>
           <w:szCs w:val="24"/>
@@ -1050,6 +1165,7 @@
         <w:spacing w:after="300" w:before="300" w:line="335.99999999999994" w:lineRule="auto"/>
         <w:rPr>
           <w:b w:val="1"/>
+          <w:bCs w:val="1"/>
           <w:color w:val="343a40"/>
           <w:sz w:val="27"/>
           <w:szCs w:val="27"/>
@@ -1060,6 +1176,7 @@
       <w:r>
         <w:rPr>
           <w:b w:val="1"/>
+          <w:bCs w:val="1"/>
           <w:color w:val="343a40"/>
           <w:sz w:val="27"/>
           <w:szCs w:val="27"/>
@@ -1117,6 +1234,7 @@
         <w:spacing w:after="300" w:before="220" w:line="335.99999999999994" w:lineRule="auto"/>
         <w:rPr>
           <w:b w:val="1"/>
+          <w:bCs w:val="1"/>
           <w:color w:val="343a40"/>
           <w:sz w:val="24"/>
           <w:szCs w:val="24"/>
@@ -1127,6 +1245,7 @@
       <w:r>
         <w:rPr>
           <w:b w:val="1"/>
+          <w:bCs w:val="1"/>
           <w:color w:val="343a40"/>
           <w:sz w:val="24"/>
           <w:szCs w:val="24"/>
@@ -1184,6 +1303,7 @@
         <w:spacing w:after="300" w:before="220" w:line="335.99999999999994" w:lineRule="auto"/>
         <w:rPr>
           <w:b w:val="1"/>
+          <w:bCs w:val="1"/>
           <w:color w:val="343a40"/>
           <w:sz w:val="24"/>
           <w:szCs w:val="24"/>
@@ -1194,6 +1314,7 @@
       <w:r>
         <w:rPr>
           <w:b w:val="1"/>
+          <w:bCs w:val="1"/>
           <w:color w:val="343a40"/>
           <w:sz w:val="24"/>
           <w:szCs w:val="24"/>
@@ -1251,6 +1372,7 @@
         <w:spacing w:after="300" w:before="300" w:line="335.99999999999994" w:lineRule="auto"/>
         <w:rPr>
           <w:b w:val="1"/>
+          <w:bCs w:val="1"/>
           <w:color w:val="343a40"/>
           <w:sz w:val="27"/>
           <w:szCs w:val="27"/>
@@ -1261,6 +1383,7 @@
       <w:r>
         <w:rPr>
           <w:b w:val="1"/>
+          <w:bCs w:val="1"/>
           <w:color w:val="343a40"/>
           <w:sz w:val="27"/>
           <w:szCs w:val="27"/>
@@ -1298,6 +1421,7 @@
         <w:spacing w:after="300" w:before="220" w:line="335.99999999999994" w:lineRule="auto"/>
         <w:rPr>
           <w:b w:val="1"/>
+          <w:bCs w:val="1"/>
           <w:color w:val="343a40"/>
           <w:sz w:val="24"/>
           <w:szCs w:val="24"/>
@@ -1308,6 +1432,7 @@
       <w:r>
         <w:rPr>
           <w:b w:val="1"/>
+          <w:bCs w:val="1"/>
           <w:color w:val="343a40"/>
           <w:sz w:val="24"/>
           <w:szCs w:val="24"/>
@@ -1354,6 +1479,51 @@
           <w:rtl w:val="0"/>
         </w:rPr>
         <w:t xml:space="preserve">Chỉ cần thực hiện đúng liệu trình, làn da của bạn sẽ trở nên tươi sáng, rạng rỡ, nâng cao tự tin và giúp quá trình trang điểm tự nhiên hơn hẳn. Điều quan trọng là lựa chọn đúng trung tâm uy tín để đảm bảo kết quả tối ưu nhất. Bên cạnh đó, việc chăm sóc tại nhà song hành cũng góp phần duy trì hiệu quả lâu dài.</w:t>
+        <w:br w:type="textWrapping"/>
+      </w:r>
+      <w:r>
+        <w:rPr>
+          <w:color w:val="495057"/>
+          <w:sz w:val="23"/>
+          <w:szCs w:val="23"/>
+        </w:rPr>
+        <w:drawing>
+          <wp:inline distB="114300" distT="114300" distL="114300" distR="114300">
+            <wp:extent cx="5731200" cy="8597900"/>
+            <wp:effectExtent b="0" l="0" r="0" t="0"/>
+            <wp:docPr id="2" name="image3.jpg"/>
+            <a:graphic>
+              <a:graphicData uri="http://schemas.openxmlformats.org/drawingml/2006/picture">
+                <pic:pic>
+                  <pic:nvPicPr>
+                    <pic:cNvPr id="0" name="image3.jpg"/>
+                    <pic:cNvPicPr preferRelativeResize="0"/>
+                  </pic:nvPicPr>
+                  <pic:blipFill>
+                    <a:blip r:embed="rId8"/>
+                    <a:srcRect b="0" l="0" r="0" t="0"/>
+                    <a:stretch>
+                      <a:fillRect/>
+                    </a:stretch>
+                  </pic:blipFill>
+                  <pic:spPr>
+                    <a:xfrm>
+                      <a:off x="0" y="0"/>
+                      <a:ext cx="5731200" cy="8597900"/>
+                    </a:xfrm>
+                    <a:prstGeom prst="rect"/>
+                    <a:ln/>
+                  </pic:spPr>
+                </pic:pic>
+              </a:graphicData>
+            </a:graphic>
+          </wp:inline>
+        </w:drawing>
+      </w:r>
+      <w:r>
+        <w:rPr>
+          <w:rtl w:val="0"/>
+        </w:rPr>
       </w:r>
     </w:p>
     <w:p>
@@ -1365,6 +1535,7 @@
         <w:spacing w:after="300" w:before="220" w:line="335.99999999999994" w:lineRule="auto"/>
         <w:rPr>
           <w:b w:val="1"/>
+          <w:bCs w:val="1"/>
           <w:color w:val="343a40"/>
           <w:sz w:val="24"/>
           <w:szCs w:val="24"/>
@@ -1375,6 +1546,7 @@
       <w:r>
         <w:rPr>
           <w:b w:val="1"/>
+          <w:bCs w:val="1"/>
           <w:color w:val="343a40"/>
           <w:sz w:val="24"/>
           <w:szCs w:val="24"/>
@@ -1432,6 +1604,7 @@
         <w:spacing w:after="300" w:before="220" w:line="335.99999999999994" w:lineRule="auto"/>
         <w:rPr>
           <w:b w:val="1"/>
+          <w:bCs w:val="1"/>
           <w:color w:val="343a40"/>
           <w:sz w:val="24"/>
           <w:szCs w:val="24"/>
@@ -1442,6 +1615,7 @@
       <w:r>
         <w:rPr>
           <w:b w:val="1"/>
+          <w:bCs w:val="1"/>
           <w:color w:val="343a40"/>
           <w:sz w:val="24"/>
           <w:szCs w:val="24"/>
@@ -1499,6 +1673,7 @@
         <w:spacing w:after="300" w:before="300" w:line="335.99999999999994" w:lineRule="auto"/>
         <w:rPr>
           <w:b w:val="1"/>
+          <w:bCs w:val="1"/>
           <w:color w:val="343a40"/>
           <w:sz w:val="27"/>
           <w:szCs w:val="27"/>
@@ -1509,6 +1684,7 @@
       <w:r>
         <w:rPr>
           <w:b w:val="1"/>
+          <w:bCs w:val="1"/>
           <w:color w:val="343a40"/>
           <w:sz w:val="27"/>
           <w:szCs w:val="27"/>
@@ -1546,6 +1722,7 @@
         <w:spacing w:after="300" w:before="220" w:line="335.99999999999994" w:lineRule="auto"/>
         <w:rPr>
           <w:b w:val="1"/>
+          <w:bCs w:val="1"/>
           <w:color w:val="343a40"/>
           <w:sz w:val="24"/>
           <w:szCs w:val="24"/>
@@ -1556,6 +1733,7 @@
       <w:r>
         <w:rPr>
           <w:b w:val="1"/>
+          <w:bCs w:val="1"/>
           <w:color w:val="343a40"/>
           <w:sz w:val="24"/>
           <w:szCs w:val="24"/>
@@ -1613,6 +1791,7 @@
         <w:spacing w:after="300" w:before="220" w:line="335.99999999999994" w:lineRule="auto"/>
         <w:rPr>
           <w:b w:val="1"/>
+          <w:bCs w:val="1"/>
           <w:color w:val="343a40"/>
           <w:sz w:val="24"/>
           <w:szCs w:val="24"/>
@@ -1623,6 +1802,7 @@
       <w:r>
         <w:rPr>
           <w:b w:val="1"/>
+          <w:bCs w:val="1"/>
           <w:color w:val="343a40"/>
           <w:sz w:val="24"/>
           <w:szCs w:val="24"/>
@@ -1680,6 +1860,7 @@
         <w:spacing w:after="300" w:before="300" w:line="335.99999999999994" w:lineRule="auto"/>
         <w:rPr>
           <w:b w:val="1"/>
+          <w:bCs w:val="1"/>
           <w:color w:val="343a40"/>
           <w:sz w:val="27"/>
           <w:szCs w:val="27"/>
@@ -1690,6 +1871,7 @@
       <w:r>
         <w:rPr>
           <w:b w:val="1"/>
+          <w:bCs w:val="1"/>
           <w:color w:val="343a40"/>
           <w:sz w:val="27"/>
           <w:szCs w:val="27"/>
@@ -1727,6 +1909,7 @@
         <w:spacing w:after="300" w:before="220" w:line="335.99999999999994" w:lineRule="auto"/>
         <w:rPr>
           <w:b w:val="1"/>
+          <w:bCs w:val="1"/>
           <w:color w:val="343a40"/>
           <w:sz w:val="24"/>
           <w:szCs w:val="24"/>
@@ -1737,6 +1920,7 @@
       <w:r>
         <w:rPr>
           <w:b w:val="1"/>
+          <w:bCs w:val="1"/>
           <w:color w:val="343a40"/>
           <w:sz w:val="24"/>
           <w:szCs w:val="24"/>
@@ -1794,6 +1978,7 @@
         <w:spacing w:after="300" w:before="300" w:line="335.99999999999994" w:lineRule="auto"/>
         <w:rPr>
           <w:b w:val="1"/>
+          <w:bCs w:val="1"/>
           <w:color w:val="343a40"/>
           <w:sz w:val="27"/>
           <w:szCs w:val="27"/>
@@ -1804,6 +1989,7 @@
       <w:r>
         <w:rPr>
           <w:b w:val="1"/>
+          <w:bCs w:val="1"/>
           <w:color w:val="343a40"/>
           <w:sz w:val="27"/>
           <w:szCs w:val="27"/>
@@ -1953,6 +2139,7 @@
     </w:pPr>
     <w:rPr>
       <w:b w:val="0"/>
+      <w:bCs w:val="0"/>
       <w:sz w:val="32"/>
       <w:szCs w:val="32"/>
     </w:rPr>
@@ -1969,6 +2156,7 @@
     </w:pPr>
     <w:rPr>
       <w:b w:val="0"/>
+      <w:bCs w:val="0"/>
       <w:color w:val="434343"/>
       <w:sz w:val="28"/>
       <w:szCs w:val="28"/>
@@ -2018,6 +2206,7 @@
     </w:pPr>
     <w:rPr>
       <w:i w:val="1"/>
+      <w:iCs w:val="1"/>
       <w:color w:val="666666"/>
       <w:sz w:val="22"/>
       <w:szCs w:val="22"/>
@@ -2051,6 +2240,7 @@
     <w:rPr>
       <w:rFonts w:ascii="Arial" w:cs="Arial" w:eastAsia="Arial" w:hAnsi="Arial"/>
       <w:i w:val="0"/>
+      <w:iCs w:val="0"/>
       <w:color w:val="666666"/>
       <w:sz w:val="30"/>
       <w:szCs w:val="30"/>

</xml_diff>